<commit_message>
PAUSED (task146): strengthening (refusal recency), stage 4 next
The refiling share now depends on the region and on the month of the refusal:
in Western, Coastal and Island two thirds to nine tenths of a quarter's
last-month refusals file again in the next quarter's first claims week, under
one in five of its earlier months'. The third quarter's refusals there fell
55.3 per cent in September, so the call is 17,000 (16,895, one sigma 83);
regional sizing on the quarter taken whole files 15,000 (14,849, every
timing-blind construction 13,767 to 15,807), the national rate and the
seasonal route 13,000. The multiplicative form lands the golden's bin; leave
one turn out 303 against 635, 758, 880. No shipped sentence names recency,
timing or region (asserted); case-note withdrawal reasons varied. Checks 179,
verify agrees, two builds byte-identical.

Co-Authored-By: Claude Opus 5.5 <noreply@anthropic.com>
Claude-Session: https://claude.ai/code/session_01A6XcFx5t62c7gPi1bBKcVi
</commit_message>
<xml_diff>
--- a/task146/golden/ic_preview_2026-10-10.docx
+++ b/task146/golden/ic_preview_2026-10-10.docx
@@ -25,7 +25,7 @@
           <w:color w:val="1F4E79"/>
           <w:sz w:val="30"/>
         </w:rPr>
-        <w:t>Initial claims, week ended 10 October: about 16,000</w:t>
+        <w:t>Initial claims, week ended 10 October: about 17,000</w:t>
       </w:r>
     </w:p>
     <w:p>
@@ -37,15 +37,15 @@
           <w:b w:val="0"/>
           <w:sz w:val="21"/>
         </w:rPr>
-        <w:t>We expect the Unemployment Insurance Board to report about 16,000 initial claims for the claims week ended 10 October 2026 when it publishes the advance count next Thursday, 15 October, up from 11,695 in the week ended 3 October.</w:t>
-      </w:r>
-    </w:p>
-    <w:p>
-      <w:r>
-        <w:rPr>
-          <w:b w:val="0"/>
-        </w:rPr>
-        <w:t>The week ended 10 October is the first claims week of the fourth quarter, the first in which claimants refused in July to September for want of base-period earnings can file again. How many of them do differs a lot from region to region. Over the past 50 quarter turns about one refused claimant in four has filed again in the first week in Western and about three in ten in Coastal and Island, where most of the refused are seasonal hotel and building workers whose last season now counts, against fewer than one in ten in the other five regions. This quarter's refusals sit where claimants come back: the third quarter left 30,182 monetarily ineligible determinations, about one and a half times a normal quarter, and 48.5 per cent of them were in Western, Coastal and Island, against about a fifth at a usual quarter turn.</w:t>
+        <w:t>We expect the Unemployment Insurance Board to report about 17,000 initial claims for the claims week ended 10 October 2026 when it publishes the advance count next Thursday, 15 October, up from 11,814 in the week ended 3 October.</w:t>
+      </w:r>
+    </w:p>
+    <w:p>
+      <w:r>
+        <w:rPr>
+          <w:b w:val="0"/>
+        </w:rPr>
+        <w:t>The week ended 10 October is the first claims week of the fourth quarter, the first in which claimants refused in July to September for want of base-period earnings can file again. How many of them do depends on where and when they were refused. Over the past 50 quarter turns, in Western, Coastal and Island, where most of the refused are seasonal hotel and building workers whose last season now counts, between two thirds and nine tenths of those refused in a quarter's last month have filed again in the first week, against under one in five of those refused in its first two months, most of whom have found other work by the turn; in the other regions few file again at all. This quarter's refusals sit where and when claimants come back: the third quarter left 26,035 monetarily ineligible determinations, 40.1 per cent of them in Western, Coastal and Island, and 55.3 per cent of those three regions' came in September, as the winter season ended and builders and hotels let staff go, against about a third in a quarter's last month at a usual turn.</w:t>
       </w:r>
     </w:p>
     <w:p>
@@ -57,7 +57,7 @@
         <w:rPr>
           <w:b w:val="0"/>
         </w:rPr>
-        <w:t>Taking each region's refused claimants at its own rate, we put the claims filed again at 4,000 to 5,000, about nine tenths of them in Western, Coastal and Island, on top of 11,000 to 12,000 for the rest of the week. The national refusals taken at the national rate would put the week near 14,000, and a seasonal reading of past October first weeks lower still, because neither allows for where this quarter's refusals sit.</w:t>
+        <w:t>Taking each region's refusals month by month at its own rates, we put the claims filed again at 5,000 to 6,000, about nine tenths of them in Western, Coastal and Island, on top of 11,000 to 12,000 for the rest of the week. Counting every refusal of the quarter alike would put the week near 15,000, and the national refusals at the national rate near 13,000, as low as a seasonal reading of past October first weeks.</w:t>
       </w:r>
     </w:p>
     <w:p>
@@ -122,7 +122,7 @@
         <w:rPr>
           <w:b w:val="0"/>
         </w:rPr>
-        <w:t>Layoffs already notified to the board for the rest of the year, by region, and the third quarter's change in claims by industry are in the attached workbook. Claims from construction and accommodation rose by more than the whole rise on a year ago; six of the other twelve industry groups are lower.</w:t>
+        <w:t>Layoffs already notified to the board for the rest of the year, by region, and the third quarter's change in claims by industry are in the attached workbook. Construction and accommodation account for almost all of the rise in claims on a year ago; five of the other twelve industry groups are lower.</w:t>
       </w:r>
     </w:p>
     <w:p>

</xml_diff>